<commit_message>
first functional beta version
</commit_message>
<xml_diff>
--- a/templates/de/cover_letter_template.docx
+++ b/templates/de/cover_letter_template.docx
@@ -520,25 +520,6 @@
       <w:r>
         <w:rPr>
           <w:rFonts w:cs="Arial" w:ascii="Arial" w:hAnsi="Arial"/>
-          <w:b w:val="false"/>
-          <w:bCs w:val="false"/>
-          <w:szCs w:val="18"/>
-          <w:lang w:val="es-CO"/>
-        </w:rPr>
-        <w:t>[adress]</w:t>
-      </w:r>
-      <w:r>
-        <w:rPr>
-          <w:rFonts w:cs="Arial" w:ascii="Arial" w:hAnsi="Arial"/>
-          <w:b/>
-          <w:szCs w:val="18"/>
-          <w:lang w:val="es-CO"/>
-        </w:rPr>
-        <w:br/>
-      </w:r>
-      <w:r>
-        <w:rPr>
-          <w:rFonts w:cs="Arial" w:ascii="Arial" w:hAnsi="Arial"/>
           <w:szCs w:val="18"/>
           <w:lang w:val="es-CO"/>
         </w:rPr>
@@ -577,23 +558,24 @@
           <w:szCs w:val="18"/>
           <w:lang w:val="es-CO"/>
         </w:rPr>
-        <w:t>Hallo [receiver</w:t>
+        <w:t>Hallo [receiver_name],</w:t>
       </w:r>
+    </w:p>
+    <w:p>
+      <w:pPr>
+        <w:pStyle w:val="Normal"/>
+        <w:rPr>
+          <w:rFonts w:ascii="Arial" w:hAnsi="Arial" w:cs="Arial"/>
+          <w:szCs w:val="18"/>
+          <w:lang w:val="es-CO"/>
+        </w:rPr>
+      </w:pPr>
       <w:r>
         <w:rPr>
           <w:rFonts w:cs="Arial" w:ascii="Arial" w:hAnsi="Arial"/>
           <w:szCs w:val="18"/>
           <w:lang w:val="es-CO"/>
         </w:rPr>
-        <w:t>_name</w:t>
-      </w:r>
-      <w:r>
-        <w:rPr>
-          <w:rFonts w:cs="Arial" w:ascii="Arial" w:hAnsi="Arial"/>
-          <w:szCs w:val="18"/>
-          <w:lang w:val="es-CO"/>
-        </w:rPr>
-        <w:t>],</w:t>
       </w:r>
     </w:p>
     <w:p>

</xml_diff>

<commit_message>
add README.md, add custom greeting, add templates in es and en
</commit_message>
<xml_diff>
--- a/templates/de/cover_letter_template.docx
+++ b/templates/de/cover_letter_template.docx
@@ -62,7 +62,7 @@
                         <w:txbxContent>
                           <w:p>
                             <w:pPr>
-                              <w:pStyle w:val="Rahmeninhalt"/>
+                              <w:pStyle w:val="Rahmeninhaltuser"/>
                               <w:spacing w:before="0" w:after="160"/>
                               <w:rPr>
                                 <w:rFonts w:ascii="Arial" w:hAnsi="Arial" w:cs="Arial"/>
@@ -98,7 +98,7 @@
                   <w:txbxContent>
                     <w:p>
                       <w:pPr>
-                        <w:pStyle w:val="Rahmeninhalt"/>
+                        <w:pStyle w:val="Rahmeninhaltuser"/>
                         <w:spacing w:before="0" w:after="160"/>
                         <w:rPr>
                           <w:rFonts w:ascii="Arial" w:hAnsi="Arial" w:cs="Arial"/>
@@ -162,7 +162,7 @@
                         <w:txbxContent>
                           <w:p>
                             <w:pPr>
-                              <w:pStyle w:val="Rahmeninhalt"/>
+                              <w:pStyle w:val="Rahmeninhaltuser"/>
                               <w:spacing w:before="0" w:after="160"/>
                               <w:jc w:val="center"/>
                               <w:rPr>
@@ -218,7 +218,7 @@
                   <w:txbxContent>
                     <w:p>
                       <w:pPr>
-                        <w:pStyle w:val="Rahmeninhalt"/>
+                        <w:pStyle w:val="Rahmeninhaltuser"/>
                         <w:spacing w:before="0" w:after="160"/>
                         <w:jc w:val="center"/>
                         <w:rPr>
@@ -302,7 +302,7 @@
                         <w:txbxContent>
                           <w:p>
                             <w:pPr>
-                              <w:pStyle w:val="Rahmeninhalt"/>
+                              <w:pStyle w:val="Rahmeninhaltuser"/>
                               <w:jc w:val="center"/>
                               <w:rPr>
                                 <w:color w:themeColor="background1" w:val="FFFFFF"/>
@@ -338,7 +338,7 @@
                           </w:p>
                           <w:p>
                             <w:pPr>
-                              <w:pStyle w:val="Rahmeninhalt"/>
+                              <w:pStyle w:val="Rahmeninhaltuser"/>
                               <w:spacing w:before="0" w:after="160"/>
                               <w:jc w:val="center"/>
                               <w:rPr>
@@ -372,7 +372,7 @@
                   <w:txbxContent>
                     <w:p>
                       <w:pPr>
-                        <w:pStyle w:val="Rahmeninhalt"/>
+                        <w:pStyle w:val="Rahmeninhaltuser"/>
                         <w:jc w:val="center"/>
                         <w:rPr>
                           <w:color w:themeColor="background1" w:val="FFFFFF"/>
@@ -408,7 +408,7 @@
                     </w:p>
                     <w:p>
                       <w:pPr>
-                        <w:pStyle w:val="Rahmeninhalt"/>
+                        <w:pStyle w:val="Rahmeninhaltuser"/>
                         <w:spacing w:before="0" w:after="160"/>
                         <w:jc w:val="center"/>
                         <w:rPr>
@@ -546,6 +546,21 @@
     <w:p>
       <w:pPr>
         <w:pStyle w:val="Normal"/>
+        <w:jc w:val="start"/>
+        <w:rPr>
+          <w:rFonts w:ascii="Arial" w:hAnsi="Arial"/>
+        </w:rPr>
+      </w:pPr>
+      <w:r>
+        <w:rPr>
+          <w:rFonts w:ascii="Arial" w:hAnsi="Arial"/>
+        </w:rPr>
+        <w:t>[greeting]</w:t>
+      </w:r>
+    </w:p>
+    <w:p>
+      <w:pPr>
+        <w:pStyle w:val="Normal"/>
         <w:rPr>
           <w:rFonts w:ascii="Arial" w:hAnsi="Arial" w:cs="Arial"/>
           <w:szCs w:val="18"/>
@@ -558,34 +573,13 @@
           <w:szCs w:val="18"/>
           <w:lang w:val="es-CO"/>
         </w:rPr>
-        <w:t>Hallo [receiver_name],</w:t>
       </w:r>
     </w:p>
     <w:p>
       <w:pPr>
         <w:pStyle w:val="Normal"/>
-        <w:rPr>
-          <w:rFonts w:ascii="Arial" w:hAnsi="Arial" w:cs="Arial"/>
-          <w:szCs w:val="18"/>
-          <w:lang w:val="es-CO"/>
-        </w:rPr>
-      </w:pPr>
-      <w:r>
-        <w:rPr>
-          <w:rFonts w:cs="Arial" w:ascii="Arial" w:hAnsi="Arial"/>
-          <w:szCs w:val="18"/>
-          <w:lang w:val="es-CO"/>
-        </w:rPr>
-      </w:r>
-    </w:p>
-    <w:p>
-      <w:pPr>
-        <w:pStyle w:val="Normal"/>
-        <w:rPr>
-          <w:rFonts w:ascii="Arial" w:hAnsi="Arial" w:cs="Arial"/>
-          <w:szCs w:val="18"/>
-          <w:lang w:val="es-CO"/>
-        </w:rPr>
+        <w:jc w:val="both"/>
+        <w:rPr/>
       </w:pPr>
       <w:r>
         <w:rPr>
@@ -1726,15 +1720,15 @@
       <w:rFonts w:cs="Lucida Sans"/>
     </w:rPr>
   </w:style>
+  <w:style w:type="paragraph" w:styleId="Kopf-Fuzeileuser">
+    <w:name w:val="Kopf-/Fußzeile (user)"/>
+    <w:basedOn w:val="Normal"/>
+    <w:qFormat/>
+    <w:pPr/>
+    <w:rPr/>
+  </w:style>
   <w:style w:type="paragraph" w:styleId="Kopf-Fuzeile">
     <w:name w:val="Kopf-/Fußzeile"/>
-    <w:basedOn w:val="Normal"/>
-    <w:qFormat/>
-    <w:pPr/>
-    <w:rPr/>
-  </w:style>
-  <w:style w:type="paragraph" w:styleId="Kopf-Fuzeileuser">
-    <w:name w:val="Kopf-/Fußzeile (user)"/>
     <w:basedOn w:val="Normal"/>
     <w:qFormat/>
     <w:pPr/>
@@ -1854,6 +1848,13 @@
     </w:pPr>
     <w:rPr/>
   </w:style>
+  <w:style w:type="paragraph" w:styleId="Rahmeninhaltuser">
+    <w:name w:val="Rahmeninhalt (user)"/>
+    <w:basedOn w:val="Normal"/>
+    <w:qFormat/>
+    <w:pPr/>
+    <w:rPr/>
+  </w:style>
   <w:style w:type="paragraph" w:styleId="Rahmeninhalt">
     <w:name w:val="Rahmeninhalt"/>
     <w:basedOn w:val="Normal"/>
@@ -1861,15 +1862,8 @@
     <w:pPr/>
     <w:rPr/>
   </w:style>
-  <w:style w:type="paragraph" w:styleId="Rahmeninhaltuser">
-    <w:name w:val="Rahmeninhalt (user)"/>
-    <w:basedOn w:val="Normal"/>
-    <w:qFormat/>
-    <w:pPr/>
-    <w:rPr/>
-  </w:style>
-  <w:style w:type="numbering" w:styleId="KeineListe" w:default="1">
-    <w:name w:val="Keine Liste"/>
+  <w:style w:type="numbering" w:styleId="KeineListeuser" w:default="1">
+    <w:name w:val="Keine Liste (user)"/>
     <w:uiPriority w:val="99"/>
     <w:semiHidden/>
     <w:unhideWhenUsed/>

</xml_diff>

<commit_message>
correct job details extraction, Remove __pycache__ from git tracking, upate system prompts
</commit_message>
<xml_diff>
--- a/templates/de/cover_letter_template.docx
+++ b/templates/de/cover_letter_template.docx
@@ -62,7 +62,7 @@
                         <w:txbxContent>
                           <w:p>
                             <w:pPr>
-                              <w:pStyle w:val="Rahmeninhaltuser"/>
+                              <w:pStyle w:val="Rahmeninhalt"/>
                               <w:spacing w:before="0" w:after="160"/>
                               <w:rPr>
                                 <w:rFonts w:ascii="Arial" w:hAnsi="Arial" w:cs="Arial"/>
@@ -98,7 +98,7 @@
                   <w:txbxContent>
                     <w:p>
                       <w:pPr>
-                        <w:pStyle w:val="Rahmeninhaltuser"/>
+                        <w:pStyle w:val="Rahmeninhalt"/>
                         <w:spacing w:before="0" w:after="160"/>
                         <w:rPr>
                           <w:rFonts w:ascii="Arial" w:hAnsi="Arial" w:cs="Arial"/>
@@ -162,7 +162,7 @@
                         <w:txbxContent>
                           <w:p>
                             <w:pPr>
-                              <w:pStyle w:val="Rahmeninhaltuser"/>
+                              <w:pStyle w:val="Rahmeninhalt"/>
                               <w:spacing w:before="0" w:after="160"/>
                               <w:jc w:val="center"/>
                               <w:rPr>
@@ -218,7 +218,7 @@
                   <w:txbxContent>
                     <w:p>
                       <w:pPr>
-                        <w:pStyle w:val="Rahmeninhaltuser"/>
+                        <w:pStyle w:val="Rahmeninhalt"/>
                         <w:spacing w:before="0" w:after="160"/>
                         <w:jc w:val="center"/>
                         <w:rPr>
@@ -302,7 +302,7 @@
                         <w:txbxContent>
                           <w:p>
                             <w:pPr>
-                              <w:pStyle w:val="Rahmeninhaltuser"/>
+                              <w:pStyle w:val="Rahmeninhalt"/>
                               <w:jc w:val="center"/>
                               <w:rPr>
                                 <w:color w:themeColor="background1" w:val="FFFFFF"/>
@@ -338,7 +338,7 @@
                           </w:p>
                           <w:p>
                             <w:pPr>
-                              <w:pStyle w:val="Rahmeninhaltuser"/>
+                              <w:pStyle w:val="Rahmeninhalt"/>
                               <w:spacing w:before="0" w:after="160"/>
                               <w:jc w:val="center"/>
                               <w:rPr>
@@ -372,7 +372,7 @@
                   <w:txbxContent>
                     <w:p>
                       <w:pPr>
-                        <w:pStyle w:val="Rahmeninhaltuser"/>
+                        <w:pStyle w:val="Rahmeninhalt"/>
                         <w:jc w:val="center"/>
                         <w:rPr>
                           <w:color w:themeColor="background1" w:val="FFFFFF"/>
@@ -408,7 +408,7 @@
                     </w:p>
                     <w:p>
                       <w:pPr>
-                        <w:pStyle w:val="Rahmeninhaltuser"/>
+                        <w:pStyle w:val="Rahmeninhalt"/>
                         <w:spacing w:before="0" w:after="160"/>
                         <w:jc w:val="center"/>
                         <w:rPr>
@@ -501,6 +501,8 @@
     <w:p>
       <w:pPr>
         <w:pStyle w:val="Normal"/>
+        <w:spacing w:before="0" w:after="46"/>
+        <w:ind w:hanging="0" w:start="0"/>
         <w:rPr>
           <w:rFonts w:ascii="Arial" w:hAnsi="Arial" w:cs="Arial"/>
           <w:szCs w:val="18"/>
@@ -515,8 +517,19 @@
           <w:lang w:val="es-CO"/>
         </w:rPr>
         <w:t>[company_name]</w:t>
-        <w:br/>
       </w:r>
+    </w:p>
+    <w:p>
+      <w:pPr>
+        <w:pStyle w:val="Normal"/>
+        <w:spacing w:before="0" w:after="46"/>
+        <w:ind w:hanging="0" w:start="0"/>
+        <w:rPr>
+          <w:rFonts w:ascii="Arial" w:hAnsi="Arial" w:cs="Arial"/>
+          <w:szCs w:val="18"/>
+          <w:lang w:val="es-CO"/>
+        </w:rPr>
+      </w:pPr>
       <w:r>
         <w:rPr>
           <w:rFonts w:cs="Arial" w:ascii="Arial" w:hAnsi="Arial"/>
@@ -609,7 +622,7 @@
     <w:p>
       <w:pPr>
         <w:pStyle w:val="Normal"/>
-        <w:spacing w:before="0" w:after="160"/>
+        <w:spacing w:before="0" w:after="0"/>
         <w:rPr>
           <w:rFonts w:ascii="Arial" w:hAnsi="Arial" w:cs="Arial"/>
           <w:szCs w:val="18"/>
@@ -621,7 +634,22 @@
           <w:szCs w:val="18"/>
         </w:rPr>
         <w:t>Mit freundlichen Grüßen</w:t>
-        <w:br/>
+      </w:r>
+    </w:p>
+    <w:p>
+      <w:pPr>
+        <w:pStyle w:val="Normal"/>
+        <w:spacing w:before="0" w:after="0"/>
+        <w:rPr>
+          <w:rFonts w:ascii="Arial" w:hAnsi="Arial" w:cs="Arial"/>
+          <w:szCs w:val="18"/>
+        </w:rPr>
+      </w:pPr>
+      <w:r>
+        <w:rPr>
+          <w:rFonts w:cs="Arial" w:ascii="Arial" w:hAnsi="Arial"/>
+          <w:szCs w:val="18"/>
+        </w:rPr>
         <w:t>Juan Aponte</w:t>
       </w:r>
     </w:p>
@@ -1720,15 +1748,15 @@
       <w:rFonts w:cs="Lucida Sans"/>
     </w:rPr>
   </w:style>
+  <w:style w:type="paragraph" w:styleId="Kopf-Fuzeile">
+    <w:name w:val="Kopf-/Fußzeile"/>
+    <w:basedOn w:val="Normal"/>
+    <w:qFormat/>
+    <w:pPr/>
+    <w:rPr/>
+  </w:style>
   <w:style w:type="paragraph" w:styleId="Kopf-Fuzeileuser">
     <w:name w:val="Kopf-/Fußzeile (user)"/>
-    <w:basedOn w:val="Normal"/>
-    <w:qFormat/>
-    <w:pPr/>
-    <w:rPr/>
-  </w:style>
-  <w:style w:type="paragraph" w:styleId="Kopf-Fuzeile">
-    <w:name w:val="Kopf-/Fußzeile"/>
     <w:basedOn w:val="Normal"/>
     <w:qFormat/>
     <w:pPr/>
@@ -1848,6 +1876,13 @@
     </w:pPr>
     <w:rPr/>
   </w:style>
+  <w:style w:type="paragraph" w:styleId="Rahmeninhalt">
+    <w:name w:val="Rahmeninhalt"/>
+    <w:basedOn w:val="Normal"/>
+    <w:qFormat/>
+    <w:pPr/>
+    <w:rPr/>
+  </w:style>
   <w:style w:type="paragraph" w:styleId="Rahmeninhaltuser">
     <w:name w:val="Rahmeninhalt (user)"/>
     <w:basedOn w:val="Normal"/>
@@ -1855,15 +1890,8 @@
     <w:pPr/>
     <w:rPr/>
   </w:style>
-  <w:style w:type="paragraph" w:styleId="Rahmeninhalt">
-    <w:name w:val="Rahmeninhalt"/>
-    <w:basedOn w:val="Normal"/>
-    <w:qFormat/>
-    <w:pPr/>
-    <w:rPr/>
-  </w:style>
-  <w:style w:type="numbering" w:styleId="KeineListeuser" w:default="1">
-    <w:name w:val="Keine Liste (user)"/>
+  <w:style w:type="numbering" w:styleId="KeineListe" w:default="1">
+    <w:name w:val="Keine Liste"/>
     <w:uiPriority w:val="99"/>
     <w:semiHidden/>
     <w:unhideWhenUsed/>

</xml_diff>